<commit_message>
Rename files from qmd to Rmd for wider compatibility.
</commit_message>
<xml_diff>
--- a/docs/Resume_of_Steven_Leung.docx
+++ b/docs/Resume_of_Steven_Leung.docx
@@ -74,7 +74,7 @@
         </w:numPr>
       </w:pPr>
       <w:r>
-        <w:t xml:space="preserve">3 years of experience as Wildlife Application Specialist at Canadian Wildlife Service (CWS), Environment and Climate Change Canada (ECCC).</w:t>
+        <w:t xml:space="preserve">3 years and 1 month of experience as Wildlife Application Specialist at Canadian Wildlife Service (CWS), Environment and Climate Change Canada (ECCC).</w:t>
       </w:r>
     </w:p>
     <w:p>
@@ -134,7 +134,7 @@
         </w:numPr>
       </w:pPr>
       <w:r>
-        <w:t xml:space="preserve">Qualified in a fully-assessed pools for IT-02 (IT Analyst) with Environment and Climate Change Canada (ECCC) and Shared Services Canada (SSC)</w:t>
+        <w:t xml:space="preserve">Qualified in 2 fully-assessed pools for IT-02 (IT Analyst) with Environment and Climate Change Canada (ECCC) and Shared Services Canada (SSC)</w:t>
       </w:r>
     </w:p>
     <w:p>
@@ -158,7 +158,7 @@
         </w:numPr>
       </w:pPr>
       <w:r>
-        <w:t xml:space="preserve">3 years of experience in data transformation/analysis in Python and SQL</w:t>
+        <w:t xml:space="preserve">3 years and 1 month of experience in data transformation/analysis in Python and SQL</w:t>
       </w:r>
     </w:p>
     <w:p>
@@ -170,7 +170,7 @@
         </w:numPr>
       </w:pPr>
       <w:r>
-        <w:t xml:space="preserve">4.5+ years of experience of artificial intelligence consultancy</w:t>
+        <w:t xml:space="preserve">4.5+ years of experience in artificial intelligence consultancy</w:t>
       </w:r>
     </w:p>
     <w:p>
@@ -182,7 +182,7 @@
         </w:numPr>
       </w:pPr>
       <w:r>
-        <w:t xml:space="preserve">10+ years of experience as project management/technical consultancy</w:t>
+        <w:t xml:space="preserve">10+ years of experience in project management and technical consultancy</w:t>
       </w:r>
     </w:p>
     <w:p>
@@ -261,7 +261,7 @@
         </w:numPr>
       </w:pPr>
       <w:r>
-        <w:t xml:space="preserve">Achievement: Increased automated data ingestion from 50% to over 70% (40% improvement) by experimenting different multi-stage name-matching strategies and choosing the best, greatly reducing manual effort and improving data timeliness.</w:t>
+        <w:t xml:space="preserve">Achievement: Increased automated data ingestion from 50% to over 70% (40% improvement) by experimenting with different multi-stage name-matching strategies and choosing the best, greatly reducing manual effort and improving data timeliness.</w:t>
       </w:r>
     </w:p>
     <w:p>
@@ -658,13 +658,7 @@
         <w:t xml:space="preserve"> </w:t>
       </w:r>
       <w:r>
-        <w:t xml:space="preserve">“</w:t>
-      </w:r>
-      <w:r>
-        <w:t xml:space="preserve">Project Advisor: Risk and Requirements Applications</w:t>
-      </w:r>
-      <w:r>
-        <w:t xml:space="preserve">”</w:t>
+        <w:t xml:space="preserve">“Project Advisor: Risk and Requirements Applications”</w:t>
       </w:r>
     </w:p>
     <w:p>
@@ -694,13 +688,7 @@
         <w:t xml:space="preserve"> </w:t>
       </w:r>
       <w:r>
-        <w:t xml:space="preserve">“</w:t>
-      </w:r>
-      <w:r>
-        <w:t xml:space="preserve">Detection and Mitigation of Data Drift and Model Decay</w:t>
-      </w:r>
-      <w:r>
-        <w:t xml:space="preserve">”</w:t>
+        <w:t xml:space="preserve">“Detection and Mitigation of Data Drift and Model Decay”</w:t>
       </w:r>
       <w:r>
         <w:t xml:space="preserve"> </w:t>
@@ -742,7 +730,7 @@
         </w:numPr>
       </w:pPr>
       <w:r>
-        <w:t xml:space="preserve">Cloud Deployment of Machine Learning Model (Mar-Apr 2022): Deploying an API on AWS to predict daily rainfall in Sydney, Australia.</w:t>
+        <w:t xml:space="preserve">Cloud Deployment of Machine Learning Model (Mar-Apr 2022): API on AWS to predict daily rainfall in Sydney, Australia.</w:t>
       </w:r>
     </w:p>
     <w:p>
@@ -897,9 +885,15 @@
       <w:r>
         <w:t xml:space="preserve">Attended and evaluated data visualization presentations (e.g., Tableau dashboards) from all teams.</w:t>
       </w:r>
-      <w:r>
-        <w:t xml:space="preserve"> </w:t>
-      </w:r>
+    </w:p>
+    <w:p>
+      <w:pPr>
+        <w:pStyle w:val="Compact"/>
+        <w:numPr>
+          <w:ilvl w:val="1"/>
+          <w:numId w:val="1021"/>
+        </w:numPr>
+      </w:pPr>
       <w:r>
         <w:t xml:space="preserve">Provided constructive feedback on strengths and areas for improvement, simulating a real business setting.</w:t>
       </w:r>
@@ -1053,7 +1047,7 @@
         </w:numPr>
       </w:pPr>
       <w:r>
-        <w:t xml:space="preserve">French (SLE Level B for reading and written. Oral test pending.)</w:t>
+        <w:t xml:space="preserve">French (SLE Level B for reading and written. Level A for oral.)</w:t>
       </w:r>
     </w:p>
     <w:p>
@@ -1078,1024 +1072,10 @@
       </w:pPr>
       <w:r>
         <w:t xml:space="preserve">Professionally Proficient in written Japanese (JLPT N1)</w:t>
-      </w:r>
-    </w:p>
-    <w:p>
-      <w:pPr>
-        <w:pStyle w:val="FirstParagraph"/>
-      </w:pPr>
-      <w:r>
-        <w:rPr>
-          <w:rStyle w:val="VerbatimChar"/>
-        </w:rPr>
-        <w:t xml:space="preserve">{r setup, include=FALSE} library(lubridate) start_date &lt;- ymd("2023-06-19") end_date &lt;- today() time_diff &lt;- interval(start_date, end_date) years &lt;- as.period(time_diff)@year months &lt;- as.period(time_diff)@month time_lapsed_str &lt;- ifelse(years &gt; 0 &amp; months &gt; 0,                           paste0(years, " year", ifelse(years != 1, "s", ""), " and ", months, " month", ifelse(months != 1, "s", "")),                           ifelse(years &gt; 0,                                  paste0(years, " year", ifelse(years != 1, "s", "")),                                  paste0(months, " month", ifelse(months != 1, "s", ""))))</w:t>
       </w:r>
     </w:p>
     <w:bookmarkEnd w:id="40"/>
     <w:bookmarkEnd w:id="41"/>
-    <w:bookmarkStart w:id="56" w:name="Xe311f99f1cba5797302b39d3225a2962777be49"/>
-    <w:p>
-      <w:pPr>
-        <w:pStyle w:val="Heading1"/>
-      </w:pPr>
-      <w:r>
-        <w:t xml:space="preserve">STEVEN LEUNG, Master of Data Science, PMP</w:t>
-      </w:r>
-    </w:p>
-    <w:p>
-      <w:pPr>
-        <w:pStyle w:val="Compact"/>
-        <w:numPr>
-          <w:ilvl w:val="0"/>
-          <w:numId w:val="1026"/>
-        </w:numPr>
-      </w:pPr>
-      <w:hyperlink r:id="rId20">
-        <w:r>
-          <w:rPr>
-            <w:rStyle w:val="Hyperlink"/>
-          </w:rPr>
-          <w:t xml:space="preserve">steven.leung@alumni.ucla.edu</w:t>
-        </w:r>
-      </w:hyperlink>
-      <w:r>
-        <w:t xml:space="preserve">, Mobile: 604-499-3173,</w:t>
-      </w:r>
-      <w:r>
-        <w:t xml:space="preserve"> </w:t>
-      </w:r>
-      <w:hyperlink r:id="rId21">
-        <w:r>
-          <w:rPr>
-            <w:rStyle w:val="Hyperlink"/>
-          </w:rPr>
-          <w:t xml:space="preserve">LinkedIn</w:t>
-        </w:r>
-      </w:hyperlink>
-      <w:r>
-        <w:t xml:space="preserve">,</w:t>
-      </w:r>
-      <w:r>
-        <w:t xml:space="preserve"> </w:t>
-      </w:r>
-      <w:hyperlink r:id="rId22">
-        <w:r>
-          <w:rPr>
-            <w:rStyle w:val="Hyperlink"/>
-          </w:rPr>
-          <w:t xml:space="preserve">GitHub</w:t>
-        </w:r>
-      </w:hyperlink>
-    </w:p>
-    <w:bookmarkStart w:id="42" w:name="professional-summary-1"/>
-    <w:p>
-      <w:pPr>
-        <w:pStyle w:val="Heading2"/>
-      </w:pPr>
-      <w:r>
-        <w:t xml:space="preserve">PROFESSIONAL SUMMARY</w:t>
-      </w:r>
-    </w:p>
-    <w:p>
-      <w:pPr>
-        <w:pStyle w:val="Compact"/>
-        <w:numPr>
-          <w:ilvl w:val="0"/>
-          <w:numId w:val="1027"/>
-        </w:numPr>
-      </w:pPr>
-      <w:r>
-        <w:rPr>
-          <w:rStyle w:val="VerbatimChar"/>
-        </w:rPr>
-        <w:t xml:space="preserve">r time_lapsed_str</w:t>
-      </w:r>
-      <w:r>
-        <w:t xml:space="preserve"> </w:t>
-      </w:r>
-      <w:r>
-        <w:t xml:space="preserve">of experience in data transformation/analysis in Python and SQL</w:t>
-      </w:r>
-    </w:p>
-    <w:p>
-      <w:pPr>
-        <w:pStyle w:val="Compact"/>
-        <w:numPr>
-          <w:ilvl w:val="0"/>
-          <w:numId w:val="1027"/>
-        </w:numPr>
-      </w:pPr>
-      <w:r>
-        <w:t xml:space="preserve">4.5+ years of experience of artificial intelligence consultancy</w:t>
-      </w:r>
-    </w:p>
-    <w:p>
-      <w:pPr>
-        <w:pStyle w:val="Compact"/>
-        <w:numPr>
-          <w:ilvl w:val="0"/>
-          <w:numId w:val="1027"/>
-        </w:numPr>
-      </w:pPr>
-      <w:r>
-        <w:t xml:space="preserve">10+ years of experience as project management/technical consultancy</w:t>
-      </w:r>
-    </w:p>
-    <w:p>
-      <w:pPr>
-        <w:pStyle w:val="Compact"/>
-        <w:numPr>
-          <w:ilvl w:val="0"/>
-          <w:numId w:val="1027"/>
-        </w:numPr>
-      </w:pPr>
-      <w:r>
-        <w:t xml:space="preserve">Master of Data Science, UBC</w:t>
-      </w:r>
-    </w:p>
-    <w:p>
-      <w:pPr>
-        <w:pStyle w:val="Compact"/>
-        <w:numPr>
-          <w:ilvl w:val="0"/>
-          <w:numId w:val="1027"/>
-        </w:numPr>
-      </w:pPr>
-      <w:r>
-        <w:t xml:space="preserve">Project Management Professional (PMP) certified since 2017</w:t>
-      </w:r>
-    </w:p>
-    <w:bookmarkEnd w:id="42"/>
-    <w:bookmarkStart w:id="47" w:name="relevant-professional-experience-1"/>
-    <w:p>
-      <w:pPr>
-        <w:pStyle w:val="Heading2"/>
-      </w:pPr>
-      <w:r>
-        <w:t xml:space="preserve">RELEVANT PROFESSIONAL EXPERIENCE</w:t>
-      </w:r>
-    </w:p>
-    <w:bookmarkStart w:id="43" w:name="X04fc697f017d43ef15116255827a0dddfc0c8fa"/>
-    <w:p>
-      <w:pPr>
-        <w:pStyle w:val="Heading3"/>
-      </w:pPr>
-      <w:r>
-        <w:t xml:space="preserve">Wildlife Application Specialist (PC-02), CWS of ECCC, June 2023-Present</w:t>
-      </w:r>
-    </w:p>
-    <w:p>
-      <w:pPr>
-        <w:pStyle w:val="Compact"/>
-        <w:numPr>
-          <w:ilvl w:val="0"/>
-          <w:numId w:val="1028"/>
-        </w:numPr>
-      </w:pPr>
-      <w:r>
-        <w:t xml:space="preserve">Support end-to-end data solutions by providing Python and SQL development for ETL-style data pipelines, PDF reporting, and automated data quality checks.</w:t>
-      </w:r>
-    </w:p>
-    <w:p>
-      <w:pPr>
-        <w:pStyle w:val="Compact"/>
-        <w:numPr>
-          <w:ilvl w:val="1"/>
-          <w:numId w:val="1029"/>
-        </w:numPr>
-      </w:pPr>
-      <w:r>
-        <w:t xml:space="preserve">Achievement: Increased automated data ingestion from 50% to over 70% (40% improvement) by experimenting different multi-stage name-matching strategies and choosing the best, greatly reducing manual effort and improving data timeliness.</w:t>
-      </w:r>
-    </w:p>
-    <w:p>
-      <w:pPr>
-        <w:pStyle w:val="Compact"/>
-        <w:numPr>
-          <w:ilvl w:val="0"/>
-          <w:numId w:val="1028"/>
-        </w:numPr>
-      </w:pPr>
-      <w:r>
-        <w:t xml:space="preserve">Ensure timely releases (100% success rate) for the SAR-DMTS by leading UATs, collaborating with SMEs across departments, and resolving critical issues through bug fixes or workarounds, contributing to the administration of the SARA (</w:t>
-      </w:r>
-      <w:hyperlink r:id="rId24">
-        <w:r>
-          <w:rPr>
-            <w:rStyle w:val="Hyperlink"/>
-          </w:rPr>
-          <w:t xml:space="preserve">Species at risk public registry</w:t>
-        </w:r>
-      </w:hyperlink>
-      <w:r>
-        <w:t xml:space="preserve">).</w:t>
-      </w:r>
-    </w:p>
-    <w:p>
-      <w:pPr>
-        <w:pStyle w:val="Compact"/>
-        <w:numPr>
-          <w:ilvl w:val="0"/>
-          <w:numId w:val="1028"/>
-        </w:numPr>
-      </w:pPr>
-      <w:r>
-        <w:t xml:space="preserve">Develop and enhance application modernization materials and documentation, clarifying business processes, data flows and system functionalities for internal stakeholders.</w:t>
-      </w:r>
-    </w:p>
-    <w:bookmarkEnd w:id="43"/>
-    <w:bookmarkStart w:id="44" w:name="X6770a6585d1533eadb7f0029642fc6938980eca"/>
-    <w:p>
-      <w:pPr>
-        <w:pStyle w:val="Heading3"/>
-      </w:pPr>
-      <w:r>
-        <w:t xml:space="preserve">Project Consultant of A.I. / Head of Sales, ClusterTech Limited, November 2016-June 2021</w:t>
-      </w:r>
-    </w:p>
-    <w:p>
-      <w:pPr>
-        <w:pStyle w:val="Compact"/>
-        <w:numPr>
-          <w:ilvl w:val="0"/>
-          <w:numId w:val="1030"/>
-        </w:numPr>
-      </w:pPr>
-      <w:r>
-        <w:t xml:space="preserve">Drove the full customer lifecycle consultancy for data science projects, delivering solutions from pre-sales to delivery, resulting in enhanced client satisfaction.</w:t>
-      </w:r>
-    </w:p>
-    <w:p>
-      <w:pPr>
-        <w:pStyle w:val="Compact"/>
-        <w:numPr>
-          <w:ilvl w:val="0"/>
-          <w:numId w:val="1030"/>
-        </w:numPr>
-      </w:pPr>
-      <w:r>
-        <w:t xml:space="preserve">Managed P&amp;L of Sales with a focus on HPC and AI/ML/Analytics technologies, surpassing AI &amp; Analytics targets in FY 2018-19 through strategic market segmentation and partnership development.</w:t>
-      </w:r>
-    </w:p>
-    <w:p>
-      <w:pPr>
-        <w:pStyle w:val="Compact"/>
-        <w:numPr>
-          <w:ilvl w:val="0"/>
-          <w:numId w:val="1030"/>
-        </w:numPr>
-      </w:pPr>
-      <w:r>
-        <w:t xml:space="preserve">Secured lucrative contracts by crafting complex RFP responses in collaboration with the data science team and external partners.</w:t>
-      </w:r>
-    </w:p>
-    <w:bookmarkEnd w:id="44"/>
-    <w:bookmarkStart w:id="45" w:name="X0be9e5fe4fcebcc2d529b55f8e6b5a67175c83b"/>
-    <w:p>
-      <w:pPr>
-        <w:pStyle w:val="Heading3"/>
-      </w:pPr>
-      <w:r>
-        <w:t xml:space="preserve">Regional Account Manager (Asia Pacific), The Collinson Group, November 2015-November 2016</w:t>
-      </w:r>
-    </w:p>
-    <w:p>
-      <w:pPr>
-        <w:pStyle w:val="Compact"/>
-        <w:numPr>
-          <w:ilvl w:val="0"/>
-          <w:numId w:val="1031"/>
-        </w:numPr>
-      </w:pPr>
-      <w:r>
-        <w:t xml:space="preserve">Oversaw project implementation and product/market readiness for new deals, including digital lounge programs, maintaining 100% SLA compliance since Dec 2015 through proactive account servicing.</w:t>
-      </w:r>
-    </w:p>
-    <w:bookmarkEnd w:id="45"/>
-    <w:bookmarkStart w:id="46" w:name="X1b3796de806072ac07cc9440e7ec40792b42503"/>
-    <w:p>
-      <w:pPr>
-        <w:pStyle w:val="Heading3"/>
-      </w:pPr>
-      <w:r>
-        <w:t xml:space="preserve">Business Solutions Consultant, Business Markets, SmarTone Mobile Communications Limited, August 2013-November 2015</w:t>
-      </w:r>
-    </w:p>
-    <w:p>
-      <w:pPr>
-        <w:pStyle w:val="Compact"/>
-        <w:numPr>
-          <w:ilvl w:val="0"/>
-          <w:numId w:val="1032"/>
-        </w:numPr>
-      </w:pPr>
-      <w:r>
-        <w:t xml:space="preserve">Led productization and implementation projects for B2B products and services, transitioning from initial qualification to market launch, covering areas such as cloud solutions and mobile app development.</w:t>
-      </w:r>
-    </w:p>
-    <w:p>
-      <w:pPr>
-        <w:pStyle w:val="Compact"/>
-        <w:numPr>
-          <w:ilvl w:val="0"/>
-          <w:numId w:val="1032"/>
-        </w:numPr>
-      </w:pPr>
-      <w:r>
-        <w:t xml:space="preserve">Developed and implemented an ICT Training Program, boosting the department’s ICT solution selling skills.</w:t>
-      </w:r>
-    </w:p>
-    <w:p>
-      <w:pPr>
-        <w:pStyle w:val="Compact"/>
-        <w:numPr>
-          <w:ilvl w:val="0"/>
-          <w:numId w:val="1032"/>
-        </w:numPr>
-      </w:pPr>
-      <w:r>
-        <w:t xml:space="preserve">Conducted monthly ICT business reviews with senior management, utilizing tools like Cognos and MS Excel to inform strategic decisions.</w:t>
-      </w:r>
-    </w:p>
-    <w:bookmarkEnd w:id="46"/>
-    <w:bookmarkEnd w:id="47"/>
-    <w:bookmarkStart w:id="48" w:name="technical-skills-1"/>
-    <w:p>
-      <w:pPr>
-        <w:pStyle w:val="Heading2"/>
-      </w:pPr>
-      <w:r>
-        <w:t xml:space="preserve">TECHNICAL SKILLS</w:t>
-      </w:r>
-    </w:p>
-    <w:p>
-      <w:pPr>
-        <w:pStyle w:val="Compact"/>
-        <w:numPr>
-          <w:ilvl w:val="0"/>
-          <w:numId w:val="1033"/>
-        </w:numPr>
-      </w:pPr>
-      <w:r>
-        <w:t xml:space="preserve">Languages: Python (PyTorch, Pandas, Numpy, Geopandas), R, SQL, MongoDB, Stan</w:t>
-      </w:r>
-    </w:p>
-    <w:p>
-      <w:pPr>
-        <w:pStyle w:val="Compact"/>
-        <w:numPr>
-          <w:ilvl w:val="0"/>
-          <w:numId w:val="1033"/>
-        </w:numPr>
-      </w:pPr>
-      <w:r>
-        <w:t xml:space="preserve">Microsoft 365 including MS Excel (VLOOKUP, Pivot Tables), Powerpoint, Word, Power BI and Access</w:t>
-      </w:r>
-    </w:p>
-    <w:p>
-      <w:pPr>
-        <w:pStyle w:val="Compact"/>
-        <w:numPr>
-          <w:ilvl w:val="0"/>
-          <w:numId w:val="1033"/>
-        </w:numPr>
-      </w:pPr>
-      <w:r>
-        <w:t xml:space="preserve">APIs: REST APIs, JSON and XML</w:t>
-      </w:r>
-    </w:p>
-    <w:p>
-      <w:pPr>
-        <w:pStyle w:val="Compact"/>
-        <w:numPr>
-          <w:ilvl w:val="0"/>
-          <w:numId w:val="1033"/>
-        </w:numPr>
-      </w:pPr>
-      <w:r>
-        <w:t xml:space="preserve">Project Management tools: Azure DevOps, GitHub, Trello, Microsoft Project</w:t>
-      </w:r>
-    </w:p>
-    <w:p>
-      <w:pPr>
-        <w:pStyle w:val="Compact"/>
-        <w:numPr>
-          <w:ilvl w:val="0"/>
-          <w:numId w:val="1033"/>
-        </w:numPr>
-      </w:pPr>
-      <w:r>
-        <w:t xml:space="preserve">Data visualization: Altair, ggplot2, Dash, Plotly, Heroku, Shiny, Kepler.gl, MS Excel, Tableau, PowerBI</w:t>
-      </w:r>
-    </w:p>
-    <w:p>
-      <w:pPr>
-        <w:pStyle w:val="Compact"/>
-        <w:numPr>
-          <w:ilvl w:val="0"/>
-          <w:numId w:val="1033"/>
-        </w:numPr>
-      </w:pPr>
-      <w:r>
-        <w:t xml:space="preserve">Platforms/Tools: Azure DevOps, AWS (S3, EMR, EC2), FME (Safe Software), docker, git, GitHub Actions (e.g. CI/CD), GNU make, PostgreSQL, MongoDB, Spark, Heroku, conda, VS Code, Jupyter, RStudio</w:t>
-      </w:r>
-    </w:p>
-    <w:p>
-      <w:pPr>
-        <w:pStyle w:val="Compact"/>
-        <w:numPr>
-          <w:ilvl w:val="0"/>
-          <w:numId w:val="1033"/>
-        </w:numPr>
-      </w:pPr>
-      <w:r>
-        <w:t xml:space="preserve">Machine learning: classification, regression, linear models, decision tree, random forest, SVM, k-NN, clustering, natural language processing, ensemble methods, deep learning with neural networks (e.g. transformers (GPT), CNNs, Autoencoders, GANs)</w:t>
-      </w:r>
-    </w:p>
-    <w:p>
-      <w:pPr>
-        <w:pStyle w:val="Compact"/>
-        <w:numPr>
-          <w:ilvl w:val="0"/>
-          <w:numId w:val="1033"/>
-        </w:numPr>
-      </w:pPr>
-      <w:r>
-        <w:t xml:space="preserve">Statistics &amp; Probability: hypothesis testing, statistical inference, bootstrapping, simulations, experiment design (e.g. A/B testing)</w:t>
-      </w:r>
-    </w:p>
-    <w:bookmarkEnd w:id="48"/>
-    <w:bookmarkStart w:id="49" w:name="public-presentations-1"/>
-    <w:p>
-      <w:pPr>
-        <w:pStyle w:val="Heading2"/>
-      </w:pPr>
-      <w:r>
-        <w:t xml:space="preserve">PUBLIC PRESENTATIONS</w:t>
-      </w:r>
-    </w:p>
-    <w:p>
-      <w:pPr>
-        <w:pStyle w:val="Compact"/>
-        <w:numPr>
-          <w:ilvl w:val="0"/>
-          <w:numId w:val="1034"/>
-        </w:numPr>
-      </w:pPr>
-      <w:hyperlink r:id="rId31">
-        <w:r>
-          <w:rPr>
-            <w:rStyle w:val="Hyperlink"/>
-          </w:rPr>
-          <w:t xml:space="preserve">ClusterTech Demonstrates How NLP Can Facilitate in Financial Industry</w:t>
-        </w:r>
-      </w:hyperlink>
-      <w:r>
-        <w:t xml:space="preserve">, June 2020</w:t>
-      </w:r>
-    </w:p>
-    <w:p>
-      <w:pPr>
-        <w:pStyle w:val="Compact"/>
-        <w:numPr>
-          <w:ilvl w:val="0"/>
-          <w:numId w:val="1034"/>
-        </w:numPr>
-      </w:pPr>
-      <w:hyperlink r:id="rId32">
-        <w:r>
-          <w:rPr>
-            <w:rStyle w:val="Hyperlink"/>
-          </w:rPr>
-          <w:t xml:space="preserve">Using AI to Thrive in Challenging Times - ClusterTech X Pure Storage X NVIDIA Webinar</w:t>
-        </w:r>
-      </w:hyperlink>
-      <w:r>
-        <w:t xml:space="preserve">, November 2020</w:t>
-      </w:r>
-    </w:p>
-    <w:bookmarkEnd w:id="49"/>
-    <w:bookmarkStart w:id="50" w:name="relevant-education-1"/>
-    <w:p>
-      <w:pPr>
-        <w:pStyle w:val="Heading2"/>
-      </w:pPr>
-      <w:r>
-        <w:t xml:space="preserve">RELEVANT EDUCATION</w:t>
-      </w:r>
-    </w:p>
-    <w:p>
-      <w:pPr>
-        <w:pStyle w:val="Compact"/>
-        <w:numPr>
-          <w:ilvl w:val="0"/>
-          <w:numId w:val="1035"/>
-        </w:numPr>
-      </w:pPr>
-      <w:r>
-        <w:t xml:space="preserve">Master of Data Science, University of British Columbia September 2021-June 2022</w:t>
-      </w:r>
-    </w:p>
-    <w:p>
-      <w:pPr>
-        <w:pStyle w:val="Compact"/>
-        <w:numPr>
-          <w:ilvl w:val="1"/>
-          <w:numId w:val="1036"/>
-        </w:numPr>
-      </w:pPr>
-      <w:r>
-        <w:t xml:space="preserve">GPA = 93.3% (A+ equivalent)</w:t>
-      </w:r>
-    </w:p>
-    <w:p>
-      <w:pPr>
-        <w:pStyle w:val="Compact"/>
-        <w:numPr>
-          <w:ilvl w:val="1"/>
-          <w:numId w:val="1036"/>
-        </w:numPr>
-      </w:pPr>
-      <w:r>
-        <w:t xml:space="preserve">Relevant courses: Algorithms &amp; Data Structures, Databases, Spatial &amp; Time Series Analysis, Data Visualization, Automated Workflows, Machine Learning, NLP, Ethics (including EDI principles &amp; bias prevention), Cloud Computing, Capstone Project</w:t>
-      </w:r>
-    </w:p>
-    <w:p>
-      <w:pPr>
-        <w:pStyle w:val="Compact"/>
-        <w:numPr>
-          <w:ilvl w:val="0"/>
-          <w:numId w:val="1035"/>
-        </w:numPr>
-      </w:pPr>
-      <w:r>
-        <w:t xml:space="preserve">B.Sc. in Computer Science and Engineering, University of California, Los Angeles</w:t>
-      </w:r>
-    </w:p>
-    <w:bookmarkEnd w:id="50"/>
-    <w:bookmarkStart w:id="51" w:name="data-science-projects-1"/>
-    <w:p>
-      <w:pPr>
-        <w:pStyle w:val="Heading2"/>
-      </w:pPr>
-      <w:hyperlink r:id="rId35">
-        <w:r>
-          <w:rPr>
-            <w:rStyle w:val="Hyperlink"/>
-          </w:rPr>
-          <w:t xml:space="preserve">DATA SCIENCE PROJECTS</w:t>
-        </w:r>
-      </w:hyperlink>
-    </w:p>
-    <w:p>
-      <w:pPr>
-        <w:pStyle w:val="Compact"/>
-        <w:numPr>
-          <w:ilvl w:val="0"/>
-          <w:numId w:val="1037"/>
-        </w:numPr>
-      </w:pPr>
-      <w:r>
-        <w:t xml:space="preserve">Public Service Data/AI Challenge (March 2025-ongoing):</w:t>
-      </w:r>
-      <w:r>
-        <w:t xml:space="preserve"> </w:t>
-      </w:r>
-      <w:r>
-        <w:t xml:space="preserve">“</w:t>
-      </w:r>
-      <w:r>
-        <w:t xml:space="preserve">Project Advisor: Risk and Requirements Applications</w:t>
-      </w:r>
-      <w:r>
-        <w:t xml:space="preserve">”</w:t>
-      </w:r>
-    </w:p>
-    <w:p>
-      <w:pPr>
-        <w:pStyle w:val="Compact"/>
-        <w:numPr>
-          <w:ilvl w:val="1"/>
-          <w:numId w:val="1038"/>
-        </w:numPr>
-      </w:pPr>
-      <w:r>
-        <w:t xml:space="preserve">Performed proof-of-concept experiments in code (Python/LangChain) to show that Retrieval-Augmented Generation (RAG) workflow with Large-language Models (LLMs) can be used to assist in the risk assessment and requirements gathering process for public service projects.</w:t>
-      </w:r>
-    </w:p>
-    <w:p>
-      <w:pPr>
-        <w:pStyle w:val="Compact"/>
-        <w:numPr>
-          <w:ilvl w:val="0"/>
-          <w:numId w:val="1037"/>
-        </w:numPr>
-      </w:pPr>
-      <w:r>
-        <w:t xml:space="preserve">Capstone Project (May-Jun 2022):</w:t>
-      </w:r>
-      <w:r>
-        <w:t xml:space="preserve"> </w:t>
-      </w:r>
-      <w:r>
-        <w:t xml:space="preserve">“</w:t>
-      </w:r>
-      <w:r>
-        <w:t xml:space="preserve">Detection and Mitigation of Data Drift and Model Decay</w:t>
-      </w:r>
-      <w:r>
-        <w:t xml:space="preserve">”</w:t>
-      </w:r>
-      <w:r>
-        <w:t xml:space="preserve"> </w:t>
-      </w:r>
-      <w:r>
-        <w:t xml:space="preserve">for Goldspot Discoveries Corp.</w:t>
-      </w:r>
-    </w:p>
-    <w:p>
-      <w:pPr>
-        <w:pStyle w:val="Compact"/>
-        <w:numPr>
-          <w:ilvl w:val="1"/>
-          <w:numId w:val="1039"/>
-        </w:numPr>
-      </w:pPr>
-      <w:r>
-        <w:t xml:space="preserve">Engineered an adaptable Python framework that standardizes the monitoring and detection of data drift and model decay across various datasets and models, resulting in a scalable solution for ongoing data integrity.</w:t>
-      </w:r>
-    </w:p>
-    <w:p>
-      <w:pPr>
-        <w:pStyle w:val="Compact"/>
-        <w:numPr>
-          <w:ilvl w:val="1"/>
-          <w:numId w:val="1039"/>
-        </w:numPr>
-      </w:pPr>
-      <w:r>
-        <w:t xml:space="preserve">Utilized advanced tools and techniques such as PyTorch, Sci-kit Learn, Autoencoders, PCA, confidence distribution analysis, image property evaluation, and statistical tests to ensure robust performance.</w:t>
-      </w:r>
-    </w:p>
-    <w:p>
-      <w:pPr>
-        <w:pStyle w:val="Compact"/>
-        <w:numPr>
-          <w:ilvl w:val="0"/>
-          <w:numId w:val="1037"/>
-        </w:numPr>
-      </w:pPr>
-      <w:r>
-        <w:t xml:space="preserve">Cloud Deployment of Machine Learning Model (Mar-Apr 2022): Deploying an API on AWS to predict daily rainfall in Sydney, Australia.</w:t>
-      </w:r>
-    </w:p>
-    <w:p>
-      <w:pPr>
-        <w:pStyle w:val="Compact"/>
-        <w:numPr>
-          <w:ilvl w:val="1"/>
-          <w:numId w:val="1040"/>
-        </w:numPr>
-      </w:pPr>
-      <w:r>
-        <w:t xml:space="preserve">Orchestrated the deployment of a machine learning model on AWS, leveraging EC2, S3, and EMR to process a large public dataset, enabling accurate daily rainfall predictions.</w:t>
-      </w:r>
-    </w:p>
-    <w:p>
-      <w:pPr>
-        <w:pStyle w:val="Compact"/>
-        <w:numPr>
-          <w:ilvl w:val="0"/>
-          <w:numId w:val="1037"/>
-        </w:numPr>
-      </w:pPr>
-      <w:hyperlink r:id="rId36">
-        <w:r>
-          <w:rPr>
-            <w:rStyle w:val="Hyperlink"/>
-          </w:rPr>
-          <w:t xml:space="preserve">DoggoDash</w:t>
-        </w:r>
-      </w:hyperlink>
-      <w:r>
-        <w:t xml:space="preserve"> </w:t>
-      </w:r>
-      <w:r>
-        <w:t xml:space="preserve">(Feb-Mar 2022): An interactive dashboard for recommending dogs to potential owners.</w:t>
-      </w:r>
-    </w:p>
-    <w:p>
-      <w:pPr>
-        <w:pStyle w:val="Compact"/>
-        <w:numPr>
-          <w:ilvl w:val="1"/>
-          <w:numId w:val="1041"/>
-        </w:numPr>
-      </w:pPr>
-      <w:r>
-        <w:t xml:space="preserve">Created an engaging web application that recommends suitable dog breeds to prospective owners by analyzing user preferences, hosted on Heroku with dynamic visualizations powered by Plotly.</w:t>
-      </w:r>
-    </w:p>
-    <w:p>
-      <w:pPr>
-        <w:pStyle w:val="Compact"/>
-        <w:numPr>
-          <w:ilvl w:val="0"/>
-          <w:numId w:val="1037"/>
-        </w:numPr>
-      </w:pPr>
-      <w:r>
-        <w:t xml:space="preserve">EDAhelper (Jan-Feb 2022): Open-source software packages in Python and R for simplifying Exploratory Data Analysis.</w:t>
-      </w:r>
-    </w:p>
-    <w:p>
-      <w:pPr>
-        <w:pStyle w:val="Compact"/>
-        <w:numPr>
-          <w:ilvl w:val="1"/>
-          <w:numId w:val="1042"/>
-        </w:numPr>
-      </w:pPr>
-      <w:r>
-        <w:t xml:space="preserve">Developed open-source software packages that transform complex Exploratory Data Analysis into one-line codes, streamlining the data exploration process for analysts.</w:t>
-      </w:r>
-    </w:p>
-    <w:p>
-      <w:pPr>
-        <w:pStyle w:val="Compact"/>
-        <w:numPr>
-          <w:ilvl w:val="0"/>
-          <w:numId w:val="1037"/>
-        </w:numPr>
-      </w:pPr>
-      <w:r>
-        <w:t xml:space="preserve">Olympic Medals (Nov-Dec 2021): A reproducible data science report on the impact of age on winning medals</w:t>
-      </w:r>
-    </w:p>
-    <w:p>
-      <w:pPr>
-        <w:pStyle w:val="Compact"/>
-        <w:numPr>
-          <w:ilvl w:val="1"/>
-          <w:numId w:val="1043"/>
-        </w:numPr>
-      </w:pPr>
-      <w:r>
-        <w:t xml:space="preserve">Conducted a comprehensive study using reproducible data science techniques to test the hypothesis that age is a factor in winning Olympic medals, yielding insights into the correlation between age and athletic performance.</w:t>
-      </w:r>
-    </w:p>
-    <w:bookmarkEnd w:id="51"/>
-    <w:bookmarkStart w:id="52" w:name="volunteering-1"/>
-    <w:p>
-      <w:pPr>
-        <w:pStyle w:val="Heading2"/>
-      </w:pPr>
-      <w:r>
-        <w:t xml:space="preserve">VOLUNTEERING</w:t>
-      </w:r>
-    </w:p>
-    <w:p>
-      <w:pPr>
-        <w:pStyle w:val="Compact"/>
-        <w:numPr>
-          <w:ilvl w:val="0"/>
-          <w:numId w:val="1044"/>
-        </w:numPr>
-      </w:pPr>
-      <w:r>
-        <w:t xml:space="preserve">Hackathon Mentor (2 cohorts), UBC Sauder School of Business, Feb 2024 and Feb 2025</w:t>
-      </w:r>
-    </w:p>
-    <w:p>
-      <w:pPr>
-        <w:pStyle w:val="Compact"/>
-        <w:numPr>
-          <w:ilvl w:val="1"/>
-          <w:numId w:val="1045"/>
-        </w:numPr>
-      </w:pPr>
-      <w:r>
-        <w:t xml:space="preserve">Mentored a student team as they prepared for their hackathon, simulating a real-world business scenario.</w:t>
-      </w:r>
-    </w:p>
-    <w:p>
-      <w:pPr>
-        <w:pStyle w:val="Compact"/>
-        <w:numPr>
-          <w:ilvl w:val="1"/>
-          <w:numId w:val="1045"/>
-        </w:numPr>
-      </w:pPr>
-      <w:r>
-        <w:t xml:space="preserve">Acted as the team’s simulated client, answering questions about business requirements and providing guidance.</w:t>
-      </w:r>
-    </w:p>
-    <w:p>
-      <w:pPr>
-        <w:pStyle w:val="Compact"/>
-        <w:numPr>
-          <w:ilvl w:val="1"/>
-          <w:numId w:val="1045"/>
-        </w:numPr>
-      </w:pPr>
-      <w:r>
-        <w:t xml:space="preserve">Attended and evaluated data visualization presentations (e.g., Tableau dashboards) from all teams.</w:t>
-      </w:r>
-      <w:r>
-        <w:t xml:space="preserve"> </w:t>
-      </w:r>
-      <w:r>
-        <w:t xml:space="preserve">Provided constructive feedback on strengths and areas for improvement, simulating a real business setting.</w:t>
-      </w:r>
-    </w:p>
-    <w:p>
-      <w:pPr>
-        <w:pStyle w:val="Compact"/>
-        <w:numPr>
-          <w:ilvl w:val="0"/>
-          <w:numId w:val="1044"/>
-        </w:numPr>
-      </w:pPr>
-      <w:r>
-        <w:t xml:space="preserve">Mentor for MDS students (2 cohorts), UBC, November 2023-April 2025</w:t>
-      </w:r>
-    </w:p>
-    <w:p>
-      <w:pPr>
-        <w:pStyle w:val="Compact"/>
-        <w:numPr>
-          <w:ilvl w:val="1"/>
-          <w:numId w:val="1046"/>
-        </w:numPr>
-      </w:pPr>
-      <w:r>
-        <w:t xml:space="preserve">Guided and supported two MDS students, providing strategic advice and fostering professional development to prepare them for successful careers post-graduation in June 2024.</w:t>
-      </w:r>
-    </w:p>
-    <w:p>
-      <w:pPr>
-        <w:pStyle w:val="Compact"/>
-        <w:numPr>
-          <w:ilvl w:val="0"/>
-          <w:numId w:val="1044"/>
-        </w:numPr>
-      </w:pPr>
-      <w:r>
-        <w:t xml:space="preserve">Workshop on Project Management for MDS students, UBC, April 2024</w:t>
-      </w:r>
-    </w:p>
-    <w:p>
-      <w:pPr>
-        <w:pStyle w:val="Compact"/>
-        <w:numPr>
-          <w:ilvl w:val="1"/>
-          <w:numId w:val="1047"/>
-        </w:numPr>
-      </w:pPr>
-      <w:r>
-        <w:t xml:space="preserve">Delivered a workshop on project management best practices, sharing insights on effective project planning, execution, and monitoring to enhance students’ understanding of project management principles.</w:t>
-      </w:r>
-    </w:p>
-    <w:bookmarkEnd w:id="52"/>
-    <w:bookmarkStart w:id="53" w:name="other-education"/>
-    <w:p>
-      <w:pPr>
-        <w:pStyle w:val="Heading2"/>
-      </w:pPr>
-      <w:r>
-        <w:t xml:space="preserve">OTHER EDUCATION</w:t>
-      </w:r>
-    </w:p>
-    <w:p>
-      <w:pPr>
-        <w:pStyle w:val="Compact"/>
-        <w:numPr>
-          <w:ilvl w:val="0"/>
-          <w:numId w:val="1048"/>
-        </w:numPr>
-      </w:pPr>
-      <w:r>
-        <w:t xml:space="preserve">Leading for Success 10-Day Consortium Program, Executive Education, Hong Kong University of Science and Technology 2015</w:t>
-      </w:r>
-    </w:p>
-    <w:bookmarkEnd w:id="53"/>
-    <w:bookmarkStart w:id="54" w:name="specialized-training-certifications-1"/>
-    <w:p>
-      <w:pPr>
-        <w:pStyle w:val="Heading2"/>
-      </w:pPr>
-      <w:r>
-        <w:t xml:space="preserve">SPECIALIZED TRAINING / CERTIFICATIONS</w:t>
-      </w:r>
-    </w:p>
-    <w:p>
-      <w:pPr>
-        <w:pStyle w:val="Compact"/>
-        <w:numPr>
-          <w:ilvl w:val="0"/>
-          <w:numId w:val="1049"/>
-        </w:numPr>
-      </w:pPr>
-      <w:r>
-        <w:t xml:space="preserve">Certified in Cybersecurity (CC) by ISC2 since December 2023</w:t>
-      </w:r>
-    </w:p>
-    <w:p>
-      <w:pPr>
-        <w:pStyle w:val="Compact"/>
-        <w:numPr>
-          <w:ilvl w:val="0"/>
-          <w:numId w:val="1049"/>
-        </w:numPr>
-      </w:pPr>
-      <w:r>
-        <w:t xml:space="preserve">Azure Fundamentals (AZ-900) since May 2023</w:t>
-      </w:r>
-    </w:p>
-    <w:p>
-      <w:pPr>
-        <w:pStyle w:val="Compact"/>
-        <w:numPr>
-          <w:ilvl w:val="0"/>
-          <w:numId w:val="1049"/>
-        </w:numPr>
-      </w:pPr>
-      <w:r>
-        <w:t xml:space="preserve">Project Management Professional (PMP) certified (Number: 2116816) since 2017</w:t>
-      </w:r>
-    </w:p>
-    <w:p>
-      <w:pPr>
-        <w:pStyle w:val="Compact"/>
-        <w:numPr>
-          <w:ilvl w:val="0"/>
-          <w:numId w:val="1049"/>
-        </w:numPr>
-      </w:pPr>
-      <w:r>
-        <w:t xml:space="preserve">Introduction to Marketing (University of Pennsylvania), 2015</w:t>
-      </w:r>
-    </w:p>
-    <w:p>
-      <w:pPr>
-        <w:pStyle w:val="Compact"/>
-        <w:numPr>
-          <w:ilvl w:val="0"/>
-          <w:numId w:val="1049"/>
-        </w:numPr>
-      </w:pPr>
-      <w:r>
-        <w:t xml:space="preserve">Effective Use of Microsoft Excel for Business Analysis, 2015</w:t>
-      </w:r>
-    </w:p>
-    <w:p>
-      <w:pPr>
-        <w:pStyle w:val="Compact"/>
-        <w:numPr>
-          <w:ilvl w:val="0"/>
-          <w:numId w:val="1049"/>
-        </w:numPr>
-      </w:pPr>
-      <w:r>
-        <w:t xml:space="preserve">Architecting on AWS, Amazon Web Services, 2015</w:t>
-      </w:r>
-    </w:p>
-    <w:bookmarkEnd w:id="54"/>
-    <w:bookmarkStart w:id="55" w:name="languages-1"/>
-    <w:p>
-      <w:pPr>
-        <w:pStyle w:val="Heading2"/>
-      </w:pPr>
-      <w:r>
-        <w:t xml:space="preserve">LANGUAGES</w:t>
-      </w:r>
-    </w:p>
-    <w:p>
-      <w:pPr>
-        <w:pStyle w:val="Compact"/>
-        <w:numPr>
-          <w:ilvl w:val="0"/>
-          <w:numId w:val="1050"/>
-        </w:numPr>
-      </w:pPr>
-      <w:r>
-        <w:t xml:space="preserve">Fluent in Chinese (Mandarin &amp; Cantonese)</w:t>
-      </w:r>
-    </w:p>
-    <w:p>
-      <w:pPr>
-        <w:pStyle w:val="Compact"/>
-        <w:numPr>
-          <w:ilvl w:val="0"/>
-          <w:numId w:val="1050"/>
-        </w:numPr>
-      </w:pPr>
-      <w:r>
-        <w:t xml:space="preserve">Professionally Proficient in written Japanese (JLPT N1)</w:t>
-      </w:r>
-    </w:p>
-    <w:bookmarkEnd w:id="55"/>
-    <w:bookmarkEnd w:id="56"/>
     <w:sectPr/>
   </w:body>
 </w:document>
@@ -2383,81 +1363,6 @@
   <w:num w:numId="1025">
     <w:abstractNumId w:val="991"/>
   </w:num>
-  <w:num w:numId="1026">
-    <w:abstractNumId w:val="991"/>
-  </w:num>
-  <w:num w:numId="1027">
-    <w:abstractNumId w:val="991"/>
-  </w:num>
-  <w:num w:numId="1028">
-    <w:abstractNumId w:val="991"/>
-  </w:num>
-  <w:num w:numId="1029">
-    <w:abstractNumId w:val="991"/>
-  </w:num>
-  <w:num w:numId="1030">
-    <w:abstractNumId w:val="991"/>
-  </w:num>
-  <w:num w:numId="1031">
-    <w:abstractNumId w:val="991"/>
-  </w:num>
-  <w:num w:numId="1032">
-    <w:abstractNumId w:val="991"/>
-  </w:num>
-  <w:num w:numId="1033">
-    <w:abstractNumId w:val="991"/>
-  </w:num>
-  <w:num w:numId="1034">
-    <w:abstractNumId w:val="991"/>
-  </w:num>
-  <w:num w:numId="1035">
-    <w:abstractNumId w:val="991"/>
-  </w:num>
-  <w:num w:numId="1036">
-    <w:abstractNumId w:val="991"/>
-  </w:num>
-  <w:num w:numId="1037">
-    <w:abstractNumId w:val="991"/>
-  </w:num>
-  <w:num w:numId="1038">
-    <w:abstractNumId w:val="991"/>
-  </w:num>
-  <w:num w:numId="1039">
-    <w:abstractNumId w:val="991"/>
-  </w:num>
-  <w:num w:numId="1040">
-    <w:abstractNumId w:val="991"/>
-  </w:num>
-  <w:num w:numId="1041">
-    <w:abstractNumId w:val="991"/>
-  </w:num>
-  <w:num w:numId="1042">
-    <w:abstractNumId w:val="991"/>
-  </w:num>
-  <w:num w:numId="1043">
-    <w:abstractNumId w:val="991"/>
-  </w:num>
-  <w:num w:numId="1044">
-    <w:abstractNumId w:val="991"/>
-  </w:num>
-  <w:num w:numId="1045">
-    <w:abstractNumId w:val="991"/>
-  </w:num>
-  <w:num w:numId="1046">
-    <w:abstractNumId w:val="991"/>
-  </w:num>
-  <w:num w:numId="1047">
-    <w:abstractNumId w:val="991"/>
-  </w:num>
-  <w:num w:numId="1048">
-    <w:abstractNumId w:val="991"/>
-  </w:num>
-  <w:num w:numId="1049">
-    <w:abstractNumId w:val="991"/>
-  </w:num>
-  <w:num w:numId="1050">
-    <w:abstractNumId w:val="991"/>
-  </w:num>
 </w:numbering>
 </file>
 
@@ -2543,7 +1448,7 @@
   </w:style>
   <w:style w:styleId="Subtitle" w:type="paragraph">
     <w:name w:val="Subtitle"/>
-    <w:basedOn w:val="Normal"/>
+    <w:basedOn w:val="Title"/>
     <w:next w:val="BodyText"/>
     <w:link w:val="SubtitleChar"/>
     <w:uiPriority w:val="11"/>
@@ -2556,7 +1461,6 @@
     </w:pPr>
     <w:rPr>
       <w:rFonts w:cstheme="majorBidi" w:eastAsiaTheme="majorEastAsia"/>
-      <w:color w:themeColor="text1" w:themeTint="A6" w:val="595959"/>
       <w:spacing w:val="15"/>
       <w:sz w:val="28"/>
       <w:szCs w:val="28"/>
@@ -2609,7 +1513,6 @@
     </w:pPr>
     <w:rPr>
       <w:b/>
-      <w:color w:val="345A8A"/>
       <w:sz w:val="20"/>
       <w:szCs w:val="20"/>
     </w:rPr>

</xml_diff>